<commit_message>
UAT Term Life: reclassify API-validation cases as by-design; keep defects for plans/premium/covers/outputs
Co-Authored-By: Claude Sonnet 5.5 <noreply@anthropic.com>
Claude-Session: https://claude.ai/code/session_01QHwJi3zeYQjFLvR25qEcTo
</commit_message>
<xml_diff>
--- a/UAT_TermLife/TermLife_UAT_Test_Report.docx
+++ b/UAT_TermLife/TermLife_UAT_Test_Report.docx
@@ -63,22 +63,21 @@
       <w:r>
         <w:rPr>
           <w:b/>
-          <w:color w:val="C00000"/>
         </w:rPr>
-        <w:t xml:space="preserve">Verdict: NOT READY for production sign-off. </w:t>
+        <w:t xml:space="preserve">Verdict: plans, premium and covers are CORRECT; 8 defects remain in generated outputs and cancellation. </w:t>
       </w:r>
       <w:r>
-        <w:t>213 automated API test cases were executed against the InsureMO UAT back-end: 130 passed, 53 failed and 30 are observations that need a business or UI decision. The failures roll up into 18 defects, of which 2 are Critical and 5 High. A further 24 Uponly UI / workflow cases are written but could not be executed (no UI access).</w:t>
+        <w:t>213 API test cases were executed. Per the agreed position that the API performs no input validation (the Uponly UI does), validation-type cases are classed BY DESIGN (56) and recorded as risks, not defects. Result: 130 passed, 8 failed, 19 observations. 24 UI/workflow cases are written but not executed.</w:t>
       </w:r>
     </w:p>
     <w:p>
       <w:r>
-        <w:t>What works well: the core pricing engine matches the spec – all 10 Annual and 10 Single premium/commission combinations (2 options × 5 plans each) return the exact spec premium and 70% commission; sum insured per plan/coverage matches the spec (one spec typo flagged); the server ignores client-tampered premium and sum insured; create → update → load → issue → load policy works; application form and certificate PDFs populate correctly (dynamic travel row, Single/Annual wording, Arabic names, term); cancellation free-look, pro-rata and 80% refund calculations are correct, and cancel-approve / reject behave correctly with proper 4xx errors.</w:t>
+        <w:t>Plans, premium and covers: all 10 Annual and 10 Single premium/commission combinations (With/Without Travel x Plans 1-5) return the exact spec premium and 70% commission; coverages and sums insured match the spec (one spec typo flagged: Without-Travel Plan 1 Death 4,500 vs 7,500); the server overrides client-supplied premium and sum insured. Create, update, load, issue and load-policy work; application form and certificate PDFs populate correctly; cancellation refunds calculate correctly.</w:t>
       </w:r>
     </w:p>
     <w:p>
       <w:r>
-        <w:t>What blocks go-live:</w:t>
+        <w:t>Defects to fix (all relate to correctness of returned/printed details):</w:t>
       </w:r>
     </w:p>
     <w:p>
@@ -86,7 +85,7 @@
         <w:pStyle w:val="ListBullet"/>
       </w:pPr>
       <w:r>
-        <w:t>A rejected proposal can still be issued as an Effective policy (DEF-01).</w:t>
+        <w:t>DEF-01 (High): Sum Insured is double-counted – PlanList contains a duplicate, empty plan entry</w:t>
       </w:r>
     </w:p>
     <w:p>
@@ -94,7 +93,7 @@
         <w:pStyle w:val="ListBullet"/>
       </w:pPr>
       <w:r>
-        <w:t>A policy can be issued without LC/LG codes or payment details (DEF-02).</w:t>
+        <w:t>DEF-02 (High): Product Name in feed is wrong for Term Life policies</w:t>
       </w:r>
     </w:p>
     <w:p>
@@ -102,7 +101,7 @@
         <w:pStyle w:val="ListBullet"/>
       </w:pPr>
       <w:r>
-        <w:t>Total sum insured is double-counted due to a duplicate empty PlanList entry (DEF-03).</w:t>
+        <w:t>DEF-03 (High): Cancelled Date populated for non-cancelled (Effective) policies</w:t>
       </w:r>
     </w:p>
     <w:p>
@@ -110,7 +109,7 @@
         <w:pStyle w:val="ListBullet"/>
       </w:pPr>
       <w:r>
-        <w:t>The feed file labels Term Life policies as 'Personal Accident…' and fills Cancelled Date on live policies (DEF-04, DEF-05).</w:t>
+        <w:t>DEF-04 (Medium): Repeat cancel-check on a pending request returns stale refund data for the old date</w:t>
       </w:r>
     </w:p>
     <w:p>
@@ -118,7 +117,42 @@
         <w:pStyle w:val="ListBullet"/>
       </w:pPr>
       <w:r>
-        <w:t>The back-end enforces almost no mandatory-field, beneficiary-share, term or data-format validation – everything relies on the Uponly UI (DEF-06, 07, 09, 10).</w:t>
+        <w:t>DEF-05 (Medium): Free-look period mismatch: system 15 days vs application form 30 days</w:t>
+      </w:r>
+    </w:p>
+    <w:p>
+      <w:pPr>
+        <w:pStyle w:val="ListBullet"/>
+      </w:pPr>
+      <w:r>
+        <w:t>DEF-06 (Medium): Carrier name inconsistent: 'Afillar Insurance Company' vs 'Arabia Falcon Insurance'</w:t>
+      </w:r>
+    </w:p>
+    <w:p>
+      <w:pPr>
+        <w:pStyle w:val="ListBullet"/>
+      </w:pPr>
+      <w:r>
+        <w:t>DEF-07 (Medium): Application form: English cancellation clause prints '8096 of the unearned Premium'; footer 'Page 2 of 3' truncated</w:t>
+      </w:r>
+    </w:p>
+    <w:p>
+      <w:pPr>
+        <w:pStyle w:val="ListBullet"/>
+      </w:pPr>
+      <w:r>
+        <w:t>DEF-08 (Low): Feed file is missing Branch Code, LCCode and LGCode columns</w:t>
+      </w:r>
+    </w:p>
+    <w:p>
+      <w:r>
+        <w:rPr>
+          <w:b/>
+        </w:rPr>
+        <w:t xml:space="preserve">Risks accepted as by design (UI must enforce): </w:t>
+      </w:r>
+      <w:r>
+        <w:t>a rejected proposal can still be issued; issue works without LC/LG/payment details; mandatory fields, beneficiary share total, term limits, premium mode per product, age rules, ChannelCode and data formats are not checked by the API; invalid input returns HTTP 500. Please make sure the Uponly UI covers these.</w:t>
       </w:r>
     </w:p>
     <w:p>
@@ -242,6 +276,51 @@
         <w:tc>
           <w:tcPr>
             <w:tcW w:type="dxa" w:w="3402"/>
+            <w:shd w:val="clear" w:color="auto" w:fill="D9E1F2"/>
+          </w:tcPr>
+          <w:p>
+            <w:r/>
+            <w:r>
+              <w:rPr>
+                <w:sz w:val="18"/>
+              </w:rPr>
+              <w:t>BY DESIGN (no API validation)</w:t>
+            </w:r>
+          </w:p>
+        </w:tc>
+        <w:tc>
+          <w:tcPr>
+            <w:tcW w:type="dxa" w:w="1701"/>
+          </w:tcPr>
+          <w:p>
+            <w:r/>
+            <w:r>
+              <w:rPr>
+                <w:sz w:val="18"/>
+              </w:rPr>
+              <w:t>56</w:t>
+            </w:r>
+          </w:p>
+        </w:tc>
+        <w:tc>
+          <w:tcPr>
+            <w:tcW w:type="dxa" w:w="1701"/>
+          </w:tcPr>
+          <w:p>
+            <w:r/>
+            <w:r>
+              <w:rPr>
+                <w:sz w:val="18"/>
+              </w:rPr>
+              <w:t>26%</w:t>
+            </w:r>
+          </w:p>
+        </w:tc>
+      </w:tr>
+      <w:tr>
+        <w:tc>
+          <w:tcPr>
+            <w:tcW w:type="dxa" w:w="3402"/>
             <w:shd w:val="clear" w:color="auto" w:fill="FFC7CE"/>
           </w:tcPr>
           <w:p>
@@ -264,7 +343,7 @@
               <w:rPr>
                 <w:sz w:val="18"/>
               </w:rPr>
-              <w:t>53</w:t>
+              <w:t>8</w:t>
             </w:r>
           </w:p>
         </w:tc>
@@ -278,7 +357,7 @@
               <w:rPr>
                 <w:sz w:val="18"/>
               </w:rPr>
-              <w:t>25%</w:t>
+              <w:t>4%</w:t>
             </w:r>
           </w:p>
         </w:tc>
@@ -309,7 +388,7 @@
               <w:rPr>
                 <w:sz w:val="18"/>
               </w:rPr>
-              <w:t>30</w:t>
+              <w:t>19</w:t>
             </w:r>
           </w:p>
         </w:tc>
@@ -323,7 +402,7 @@
               <w:rPr>
                 <w:sz w:val="18"/>
               </w:rPr>
-              <w:t>14%</w:t>
+              <w:t>9%</w:t>
             </w:r>
           </w:p>
         </w:tc>
@@ -425,16 +504,17 @@
         <w:tblLook w:firstColumn="1" w:firstRow="1" w:lastColumn="0" w:lastRow="0" w:noHBand="0" w:noVBand="1" w:val="04A0"/>
       </w:tblPr>
       <w:tblGrid>
-        <w:gridCol w:w="1994"/>
-        <w:gridCol w:w="1994"/>
-        <w:gridCol w:w="1994"/>
-        <w:gridCol w:w="1994"/>
-        <w:gridCol w:w="1994"/>
+        <w:gridCol w:w="1662"/>
+        <w:gridCol w:w="1662"/>
+        <w:gridCol w:w="1662"/>
+        <w:gridCol w:w="1662"/>
+        <w:gridCol w:w="1662"/>
+        <w:gridCol w:w="1662"/>
       </w:tblGrid>
       <w:tr>
         <w:tc>
           <w:tcPr>
-            <w:tcW w:type="dxa" w:w="3402"/>
+            <w:tcW w:type="dxa" w:w="2835"/>
             <w:shd w:val="clear" w:color="auto" w:fill="1F3864"/>
           </w:tcPr>
           <w:p>
@@ -517,11 +597,28 @@
             </w:r>
           </w:p>
         </w:tc>
+        <w:tc>
+          <w:tcPr>
+            <w:tcW w:type="dxa" w:w="1417"/>
+            <w:shd w:val="clear" w:color="auto" w:fill="1F3864"/>
+          </w:tcPr>
+          <w:p>
+            <w:r/>
+            <w:r>
+              <w:rPr>
+                <w:b/>
+                <w:color w:val="FFFFFF"/>
+                <w:sz w:val="19"/>
+              </w:rPr>
+              <w:t>By design</w:t>
+            </w:r>
+          </w:p>
+        </w:tc>
       </w:tr>
       <w:tr>
         <w:tc>
           <w:tcPr>
-            <w:tcW w:type="dxa" w:w="3402"/>
+            <w:tcW w:type="dxa" w:w="2835"/>
           </w:tcPr>
           <w:p>
             <w:r/>
@@ -589,11 +686,25 @@
             </w:r>
           </w:p>
         </w:tc>
+        <w:tc>
+          <w:tcPr>
+            <w:tcW w:type="dxa" w:w="1417"/>
+          </w:tcPr>
+          <w:p>
+            <w:r/>
+            <w:r>
+              <w:rPr>
+                <w:sz w:val="18"/>
+              </w:rPr>
+              <w:t>0</w:t>
+            </w:r>
+          </w:p>
+        </w:tc>
       </w:tr>
       <w:tr>
         <w:tc>
           <w:tcPr>
-            <w:tcW w:type="dxa" w:w="3402"/>
+            <w:tcW w:type="dxa" w:w="2835"/>
           </w:tcPr>
           <w:p>
             <w:r/>
@@ -643,7 +754,7 @@
               <w:rPr>
                 <w:sz w:val="18"/>
               </w:rPr>
-              <w:t>2</w:t>
+              <w:t>0</w:t>
             </w:r>
           </w:p>
         </w:tc>
@@ -657,7 +768,21 @@
               <w:rPr>
                 <w:sz w:val="18"/>
               </w:rPr>
-              <w:t>4</w:t>
+              <w:t>3</w:t>
+            </w:r>
+          </w:p>
+        </w:tc>
+        <w:tc>
+          <w:tcPr>
+            <w:tcW w:type="dxa" w:w="1417"/>
+          </w:tcPr>
+          <w:p>
+            <w:r/>
+            <w:r>
+              <w:rPr>
+                <w:sz w:val="18"/>
+              </w:rPr>
+              <w:t>3</w:t>
             </w:r>
           </w:p>
         </w:tc>
@@ -665,7 +790,7 @@
       <w:tr>
         <w:tc>
           <w:tcPr>
-            <w:tcW w:type="dxa" w:w="3402"/>
+            <w:tcW w:type="dxa" w:w="2835"/>
           </w:tcPr>
           <w:p>
             <w:r/>
@@ -715,7 +840,7 @@
               <w:rPr>
                 <w:sz w:val="18"/>
               </w:rPr>
-              <w:t>2</w:t>
+              <w:t>1</w:t>
             </w:r>
           </w:p>
         </w:tc>
@@ -733,11 +858,25 @@
             </w:r>
           </w:p>
         </w:tc>
+        <w:tc>
+          <w:tcPr>
+            <w:tcW w:type="dxa" w:w="1417"/>
+          </w:tcPr>
+          <w:p>
+            <w:r/>
+            <w:r>
+              <w:rPr>
+                <w:sz w:val="18"/>
+              </w:rPr>
+              <w:t>1</w:t>
+            </w:r>
+          </w:p>
+        </w:tc>
       </w:tr>
       <w:tr>
         <w:tc>
           <w:tcPr>
-            <w:tcW w:type="dxa" w:w="3402"/>
+            <w:tcW w:type="dxa" w:w="2835"/>
           </w:tcPr>
           <w:p>
             <w:r/>
@@ -787,7 +926,7 @@
               <w:rPr>
                 <w:sz w:val="18"/>
               </w:rPr>
-              <w:t>6</w:t>
+              <w:t>0</w:t>
             </w:r>
           </w:p>
         </w:tc>
@@ -805,11 +944,25 @@
             </w:r>
           </w:p>
         </w:tc>
+        <w:tc>
+          <w:tcPr>
+            <w:tcW w:type="dxa" w:w="1417"/>
+          </w:tcPr>
+          <w:p>
+            <w:r/>
+            <w:r>
+              <w:rPr>
+                <w:sz w:val="18"/>
+              </w:rPr>
+              <w:t>6</w:t>
+            </w:r>
+          </w:p>
+        </w:tc>
       </w:tr>
       <w:tr>
         <w:tc>
           <w:tcPr>
-            <w:tcW w:type="dxa" w:w="3402"/>
+            <w:tcW w:type="dxa" w:w="2835"/>
           </w:tcPr>
           <w:p>
             <w:r/>
@@ -873,7 +1026,21 @@
               <w:rPr>
                 <w:sz w:val="18"/>
               </w:rPr>
-              <w:t>6</w:t>
+              <w:t>1</w:t>
+            </w:r>
+          </w:p>
+        </w:tc>
+        <w:tc>
+          <w:tcPr>
+            <w:tcW w:type="dxa" w:w="1417"/>
+          </w:tcPr>
+          <w:p>
+            <w:r/>
+            <w:r>
+              <w:rPr>
+                <w:sz w:val="18"/>
+              </w:rPr>
+              <w:t>5</w:t>
             </w:r>
           </w:p>
         </w:tc>
@@ -881,7 +1048,7 @@
       <w:tr>
         <w:tc>
           <w:tcPr>
-            <w:tcW w:type="dxa" w:w="3402"/>
+            <w:tcW w:type="dxa" w:w="2835"/>
           </w:tcPr>
           <w:p>
             <w:r/>
@@ -931,7 +1098,7 @@
               <w:rPr>
                 <w:sz w:val="18"/>
               </w:rPr>
-              <w:t>19</w:t>
+              <w:t>0</w:t>
             </w:r>
           </w:p>
         </w:tc>
@@ -949,11 +1116,25 @@
             </w:r>
           </w:p>
         </w:tc>
+        <w:tc>
+          <w:tcPr>
+            <w:tcW w:type="dxa" w:w="1417"/>
+          </w:tcPr>
+          <w:p>
+            <w:r/>
+            <w:r>
+              <w:rPr>
+                <w:sz w:val="18"/>
+              </w:rPr>
+              <w:t>19</w:t>
+            </w:r>
+          </w:p>
+        </w:tc>
       </w:tr>
       <w:tr>
         <w:tc>
           <w:tcPr>
-            <w:tcW w:type="dxa" w:w="3402"/>
+            <w:tcW w:type="dxa" w:w="2835"/>
           </w:tcPr>
           <w:p>
             <w:r/>
@@ -1003,7 +1184,7 @@
               <w:rPr>
                 <w:sz w:val="18"/>
               </w:rPr>
-              <w:t>2</w:t>
+              <w:t>0</w:t>
             </w:r>
           </w:p>
         </w:tc>
@@ -1021,11 +1202,25 @@
             </w:r>
           </w:p>
         </w:tc>
+        <w:tc>
+          <w:tcPr>
+            <w:tcW w:type="dxa" w:w="1417"/>
+          </w:tcPr>
+          <w:p>
+            <w:r/>
+            <w:r>
+              <w:rPr>
+                <w:sz w:val="18"/>
+              </w:rPr>
+              <w:t>2</w:t>
+            </w:r>
+          </w:p>
+        </w:tc>
       </w:tr>
       <w:tr>
         <w:tc>
           <w:tcPr>
-            <w:tcW w:type="dxa" w:w="3402"/>
+            <w:tcW w:type="dxa" w:w="2835"/>
           </w:tcPr>
           <w:p>
             <w:r/>
@@ -1075,7 +1270,7 @@
               <w:rPr>
                 <w:sz w:val="18"/>
               </w:rPr>
-              <w:t>6</w:t>
+              <w:t>0</w:t>
             </w:r>
           </w:p>
         </w:tc>
@@ -1093,11 +1288,25 @@
             </w:r>
           </w:p>
         </w:tc>
+        <w:tc>
+          <w:tcPr>
+            <w:tcW w:type="dxa" w:w="1417"/>
+          </w:tcPr>
+          <w:p>
+            <w:r/>
+            <w:r>
+              <w:rPr>
+                <w:sz w:val="18"/>
+              </w:rPr>
+              <w:t>6</w:t>
+            </w:r>
+          </w:p>
+        </w:tc>
       </w:tr>
       <w:tr>
         <w:tc>
           <w:tcPr>
-            <w:tcW w:type="dxa" w:w="3402"/>
+            <w:tcW w:type="dxa" w:w="2835"/>
           </w:tcPr>
           <w:p>
             <w:r/>
@@ -1147,7 +1356,7 @@
               <w:rPr>
                 <w:sz w:val="18"/>
               </w:rPr>
-              <w:t>1</w:t>
+              <w:t>0</w:t>
             </w:r>
           </w:p>
         </w:tc>
@@ -1161,7 +1370,21 @@
               <w:rPr>
                 <w:sz w:val="18"/>
               </w:rPr>
-              <w:t>1</w:t>
+              <w:t>0</w:t>
+            </w:r>
+          </w:p>
+        </w:tc>
+        <w:tc>
+          <w:tcPr>
+            <w:tcW w:type="dxa" w:w="1417"/>
+          </w:tcPr>
+          <w:p>
+            <w:r/>
+            <w:r>
+              <w:rPr>
+                <w:sz w:val="18"/>
+              </w:rPr>
+              <w:t>2</w:t>
             </w:r>
           </w:p>
         </w:tc>
@@ -1169,7 +1392,7 @@
       <w:tr>
         <w:tc>
           <w:tcPr>
-            <w:tcW w:type="dxa" w:w="3402"/>
+            <w:tcW w:type="dxa" w:w="2835"/>
           </w:tcPr>
           <w:p>
             <w:r/>
@@ -1219,7 +1442,7 @@
               <w:rPr>
                 <w:sz w:val="18"/>
               </w:rPr>
-              <w:t>2</w:t>
+              <w:t>0</w:t>
             </w:r>
           </w:p>
         </w:tc>
@@ -1237,11 +1460,25 @@
             </w:r>
           </w:p>
         </w:tc>
+        <w:tc>
+          <w:tcPr>
+            <w:tcW w:type="dxa" w:w="1417"/>
+          </w:tcPr>
+          <w:p>
+            <w:r/>
+            <w:r>
+              <w:rPr>
+                <w:sz w:val="18"/>
+              </w:rPr>
+              <w:t>2</w:t>
+            </w:r>
+          </w:p>
+        </w:tc>
       </w:tr>
       <w:tr>
         <w:tc>
           <w:tcPr>
-            <w:tcW w:type="dxa" w:w="3402"/>
+            <w:tcW w:type="dxa" w:w="2835"/>
           </w:tcPr>
           <w:p>
             <w:r/>
@@ -1309,11 +1546,25 @@
             </w:r>
           </w:p>
         </w:tc>
+        <w:tc>
+          <w:tcPr>
+            <w:tcW w:type="dxa" w:w="1417"/>
+          </w:tcPr>
+          <w:p>
+            <w:r/>
+            <w:r>
+              <w:rPr>
+                <w:sz w:val="18"/>
+              </w:rPr>
+              <w:t>0</w:t>
+            </w:r>
+          </w:p>
+        </w:tc>
       </w:tr>
       <w:tr>
         <w:tc>
           <w:tcPr>
-            <w:tcW w:type="dxa" w:w="3402"/>
+            <w:tcW w:type="dxa" w:w="2835"/>
           </w:tcPr>
           <w:p>
             <w:r/>
@@ -1381,11 +1632,25 @@
             </w:r>
           </w:p>
         </w:tc>
+        <w:tc>
+          <w:tcPr>
+            <w:tcW w:type="dxa" w:w="1417"/>
+          </w:tcPr>
+          <w:p>
+            <w:r/>
+            <w:r>
+              <w:rPr>
+                <w:sz w:val="18"/>
+              </w:rPr>
+              <w:t>0</w:t>
+            </w:r>
+          </w:p>
+        </w:tc>
       </w:tr>
       <w:tr>
         <w:tc>
           <w:tcPr>
-            <w:tcW w:type="dxa" w:w="3402"/>
+            <w:tcW w:type="dxa" w:w="2835"/>
           </w:tcPr>
           <w:p>
             <w:r/>
@@ -1449,6 +1714,20 @@
               <w:rPr>
                 <w:sz w:val="18"/>
               </w:rPr>
+              <w:t>0</w:t>
+            </w:r>
+          </w:p>
+        </w:tc>
+        <w:tc>
+          <w:tcPr>
+            <w:tcW w:type="dxa" w:w="1417"/>
+          </w:tcPr>
+          <w:p>
+            <w:r/>
+            <w:r>
+              <w:rPr>
+                <w:sz w:val="18"/>
+              </w:rPr>
               <w:t>2</w:t>
             </w:r>
           </w:p>
@@ -1457,7 +1736,7 @@
       <w:tr>
         <w:tc>
           <w:tcPr>
-            <w:tcW w:type="dxa" w:w="3402"/>
+            <w:tcW w:type="dxa" w:w="2835"/>
           </w:tcPr>
           <w:p>
             <w:r/>
@@ -1525,11 +1804,25 @@
             </w:r>
           </w:p>
         </w:tc>
+        <w:tc>
+          <w:tcPr>
+            <w:tcW w:type="dxa" w:w="1417"/>
+          </w:tcPr>
+          <w:p>
+            <w:r/>
+            <w:r>
+              <w:rPr>
+                <w:sz w:val="18"/>
+              </w:rPr>
+              <w:t>0</w:t>
+            </w:r>
+          </w:p>
+        </w:tc>
       </w:tr>
       <w:tr>
         <w:tc>
           <w:tcPr>
-            <w:tcW w:type="dxa" w:w="3402"/>
+            <w:tcW w:type="dxa" w:w="2835"/>
           </w:tcPr>
           <w:p>
             <w:r/>
@@ -1579,7 +1872,7 @@
               <w:rPr>
                 <w:sz w:val="18"/>
               </w:rPr>
-              <w:t>1</w:t>
+              <w:t>0</w:t>
             </w:r>
           </w:p>
         </w:tc>
@@ -1593,7 +1886,21 @@
               <w:rPr>
                 <w:sz w:val="18"/>
               </w:rPr>
-              <w:t>1</w:t>
+              <w:t>0</w:t>
+            </w:r>
+          </w:p>
+        </w:tc>
+        <w:tc>
+          <w:tcPr>
+            <w:tcW w:type="dxa" w:w="1417"/>
+          </w:tcPr>
+          <w:p>
+            <w:r/>
+            <w:r>
+              <w:rPr>
+                <w:sz w:val="18"/>
+              </w:rPr>
+              <w:t>2</w:t>
             </w:r>
           </w:p>
         </w:tc>
@@ -1601,7 +1908,7 @@
       <w:tr>
         <w:tc>
           <w:tcPr>
-            <w:tcW w:type="dxa" w:w="3402"/>
+            <w:tcW w:type="dxa" w:w="2835"/>
           </w:tcPr>
           <w:p>
             <w:r/>
@@ -1651,7 +1958,7 @@
               <w:rPr>
                 <w:sz w:val="18"/>
               </w:rPr>
-              <w:t>1</w:t>
+              <w:t>0</w:t>
             </w:r>
           </w:p>
         </w:tc>
@@ -1665,7 +1972,21 @@
               <w:rPr>
                 <w:sz w:val="18"/>
               </w:rPr>
-              <w:t>3</w:t>
+              <w:t>2</w:t>
+            </w:r>
+          </w:p>
+        </w:tc>
+        <w:tc>
+          <w:tcPr>
+            <w:tcW w:type="dxa" w:w="1417"/>
+          </w:tcPr>
+          <w:p>
+            <w:r/>
+            <w:r>
+              <w:rPr>
+                <w:sz w:val="18"/>
+              </w:rPr>
+              <w:t>2</w:t>
             </w:r>
           </w:p>
         </w:tc>
@@ -1673,7 +1994,7 @@
       <w:tr>
         <w:tc>
           <w:tcPr>
-            <w:tcW w:type="dxa" w:w="3402"/>
+            <w:tcW w:type="dxa" w:w="2835"/>
           </w:tcPr>
           <w:p>
             <w:r/>
@@ -1723,7 +2044,7 @@
               <w:rPr>
                 <w:sz w:val="18"/>
               </w:rPr>
-              <w:t>3</w:t>
+              <w:t>1</w:t>
             </w:r>
           </w:p>
         </w:tc>
@@ -1741,11 +2062,25 @@
             </w:r>
           </w:p>
         </w:tc>
+        <w:tc>
+          <w:tcPr>
+            <w:tcW w:type="dxa" w:w="1417"/>
+          </w:tcPr>
+          <w:p>
+            <w:r/>
+            <w:r>
+              <w:rPr>
+                <w:sz w:val="18"/>
+              </w:rPr>
+              <w:t>2</w:t>
+            </w:r>
+          </w:p>
+        </w:tc>
       </w:tr>
       <w:tr>
         <w:tc>
           <w:tcPr>
-            <w:tcW w:type="dxa" w:w="3402"/>
+            <w:tcW w:type="dxa" w:w="2835"/>
           </w:tcPr>
           <w:p>
             <w:r/>
@@ -1795,7 +2130,7 @@
               <w:rPr>
                 <w:sz w:val="18"/>
               </w:rPr>
-              <w:t>4</w:t>
+              <w:t>3</w:t>
             </w:r>
           </w:p>
         </w:tc>
@@ -1813,11 +2148,25 @@
             </w:r>
           </w:p>
         </w:tc>
+        <w:tc>
+          <w:tcPr>
+            <w:tcW w:type="dxa" w:w="1417"/>
+          </w:tcPr>
+          <w:p>
+            <w:r/>
+            <w:r>
+              <w:rPr>
+                <w:sz w:val="18"/>
+              </w:rPr>
+              <w:t>1</w:t>
+            </w:r>
+          </w:p>
+        </w:tc>
       </w:tr>
       <w:tr>
         <w:tc>
           <w:tcPr>
-            <w:tcW w:type="dxa" w:w="3402"/>
+            <w:tcW w:type="dxa" w:w="2835"/>
           </w:tcPr>
           <w:p>
             <w:r/>
@@ -1885,11 +2234,25 @@
             </w:r>
           </w:p>
         </w:tc>
+        <w:tc>
+          <w:tcPr>
+            <w:tcW w:type="dxa" w:w="1417"/>
+          </w:tcPr>
+          <w:p>
+            <w:r/>
+            <w:r>
+              <w:rPr>
+                <w:sz w:val="18"/>
+              </w:rPr>
+              <w:t>0</w:t>
+            </w:r>
+          </w:p>
+        </w:tc>
       </w:tr>
       <w:tr>
         <w:tc>
           <w:tcPr>
-            <w:tcW w:type="dxa" w:w="3402"/>
+            <w:tcW w:type="dxa" w:w="2835"/>
           </w:tcPr>
           <w:p>
             <w:r/>
@@ -1957,11 +2320,25 @@
             </w:r>
           </w:p>
         </w:tc>
+        <w:tc>
+          <w:tcPr>
+            <w:tcW w:type="dxa" w:w="1417"/>
+          </w:tcPr>
+          <w:p>
+            <w:r/>
+            <w:r>
+              <w:rPr>
+                <w:sz w:val="18"/>
+              </w:rPr>
+              <w:t>0</w:t>
+            </w:r>
+          </w:p>
+        </w:tc>
       </w:tr>
       <w:tr>
         <w:tc>
           <w:tcPr>
-            <w:tcW w:type="dxa" w:w="3402"/>
+            <w:tcW w:type="dxa" w:w="2835"/>
           </w:tcPr>
           <w:p>
             <w:r/>
@@ -2011,13 +2388,27 @@
               <w:rPr>
                 <w:sz w:val="18"/>
               </w:rPr>
+              <w:t>0</w:t>
+            </w:r>
+          </w:p>
+        </w:tc>
+        <w:tc>
+          <w:tcPr>
+            <w:tcW w:type="dxa" w:w="1134"/>
+          </w:tcPr>
+          <w:p>
+            <w:r/>
+            <w:r>
+              <w:rPr>
+                <w:sz w:val="18"/>
+              </w:rPr>
               <w:t>1</w:t>
             </w:r>
           </w:p>
         </w:tc>
         <w:tc>
           <w:tcPr>
-            <w:tcW w:type="dxa" w:w="1134"/>
+            <w:tcW w:type="dxa" w:w="1417"/>
           </w:tcPr>
           <w:p>
             <w:r/>
@@ -2144,124 +2535,6 @@
         <w:tc>
           <w:tcPr>
             <w:tcW w:type="dxa" w:w="1020"/>
-            <w:shd w:val="clear" w:color="auto" w:fill="FF9999"/>
-          </w:tcPr>
-          <w:p>
-            <w:r/>
-            <w:r>
-              <w:rPr>
-                <w:sz w:val="18"/>
-              </w:rPr>
-              <w:t>Critical</w:t>
-            </w:r>
-          </w:p>
-        </w:tc>
-        <w:tc>
-          <w:tcPr>
-            <w:tcW w:type="dxa" w:w="5102"/>
-          </w:tcPr>
-          <w:p>
-            <w:r/>
-            <w:r>
-              <w:rPr>
-                <w:sz w:val="18"/>
-              </w:rPr>
-              <w:t>A rejected proposal can still be issued as an Effective policy</w:t>
-            </w:r>
-          </w:p>
-        </w:tc>
-        <w:tc>
-          <w:tcPr>
-            <w:tcW w:type="dxa" w:w="2608"/>
-          </w:tcPr>
-          <w:p>
-            <w:r/>
-            <w:r>
-              <w:rPr>
-                <w:sz w:val="18"/>
-              </w:rPr>
-              <w:t>TL-REJ-02</w:t>
-            </w:r>
-          </w:p>
-        </w:tc>
-      </w:tr>
-      <w:tr>
-        <w:tc>
-          <w:tcPr>
-            <w:tcW w:type="dxa" w:w="907"/>
-          </w:tcPr>
-          <w:p>
-            <w:r/>
-            <w:r>
-              <w:rPr>
-                <w:sz w:val="18"/>
-              </w:rPr>
-              <w:t>DEF-02</w:t>
-            </w:r>
-          </w:p>
-        </w:tc>
-        <w:tc>
-          <w:tcPr>
-            <w:tcW w:type="dxa" w:w="1020"/>
-            <w:shd w:val="clear" w:color="auto" w:fill="FF9999"/>
-          </w:tcPr>
-          <w:p>
-            <w:r/>
-            <w:r>
-              <w:rPr>
-                <w:sz w:val="18"/>
-              </w:rPr>
-              <w:t>Critical</w:t>
-            </w:r>
-          </w:p>
-        </w:tc>
-        <w:tc>
-          <w:tcPr>
-            <w:tcW w:type="dxa" w:w="5102"/>
-          </w:tcPr>
-          <w:p>
-            <w:r/>
-            <w:r>
-              <w:rPr>
-                <w:sz w:val="18"/>
-              </w:rPr>
-              <w:t>Policy can be issued without LC Code, LG Code or payment/debit details</w:t>
-            </w:r>
-          </w:p>
-        </w:tc>
-        <w:tc>
-          <w:tcPr>
-            <w:tcW w:type="dxa" w:w="2608"/>
-          </w:tcPr>
-          <w:p>
-            <w:r/>
-            <w:r>
-              <w:rPr>
-                <w:sz w:val="18"/>
-              </w:rPr>
-              <w:t>TL-PAY-01, TL-PAY-02, TL-PAY-04</w:t>
-            </w:r>
-          </w:p>
-        </w:tc>
-      </w:tr>
-      <w:tr>
-        <w:tc>
-          <w:tcPr>
-            <w:tcW w:type="dxa" w:w="907"/>
-          </w:tcPr>
-          <w:p>
-            <w:r/>
-            <w:r>
-              <w:rPr>
-                <w:sz w:val="18"/>
-              </w:rPr>
-              <w:t>DEF-03</w:t>
-            </w:r>
-          </w:p>
-        </w:tc>
-        <w:tc>
-          <w:tcPr>
-            <w:tcW w:type="dxa" w:w="1020"/>
             <w:shd w:val="clear" w:color="auto" w:fill="FFC7CE"/>
           </w:tcPr>
           <w:p>
@@ -2314,7 +2587,7 @@
               <w:rPr>
                 <w:sz w:val="18"/>
               </w:rPr>
-              <w:t>DEF-04</w:t>
+              <w:t>DEF-02</w:t>
             </w:r>
           </w:p>
         </w:tc>
@@ -2373,7 +2646,7 @@
               <w:rPr>
                 <w:sz w:val="18"/>
               </w:rPr>
-              <w:t>DEF-05</w:t>
+              <w:t>DEF-03</w:t>
             </w:r>
           </w:p>
         </w:tc>
@@ -2432,125 +2705,7 @@
               <w:rPr>
                 <w:sz w:val="18"/>
               </w:rPr>
-              <w:t>DEF-06</w:t>
-            </w:r>
-          </w:p>
-        </w:tc>
-        <w:tc>
-          <w:tcPr>
-            <w:tcW w:type="dxa" w:w="1020"/>
-            <w:shd w:val="clear" w:color="auto" w:fill="FFC7CE"/>
-          </w:tcPr>
-          <w:p>
-            <w:r/>
-            <w:r>
-              <w:rPr>
-                <w:sz w:val="18"/>
-              </w:rPr>
-              <w:t>High</w:t>
-            </w:r>
-          </w:p>
-        </w:tc>
-        <w:tc>
-          <w:tcPr>
-            <w:tcW w:type="dxa" w:w="5102"/>
-          </w:tcPr>
-          <w:p>
-            <w:r/>
-            <w:r>
-              <w:rPr>
-                <w:sz w:val="18"/>
-              </w:rPr>
-              <w:t>Beneficiary share total is not validated</w:t>
-            </w:r>
-          </w:p>
-        </w:tc>
-        <w:tc>
-          <w:tcPr>
-            <w:tcW w:type="dxa" w:w="2608"/>
-          </w:tcPr>
-          <w:p>
-            <w:r/>
-            <w:r>
-              <w:rPr>
-                <w:sz w:val="18"/>
-              </w:rPr>
-              <w:t>TL-BEN-03..07, TL-BEN-10</w:t>
-            </w:r>
-          </w:p>
-        </w:tc>
-      </w:tr>
-      <w:tr>
-        <w:tc>
-          <w:tcPr>
-            <w:tcW w:type="dxa" w:w="907"/>
-          </w:tcPr>
-          <w:p>
-            <w:r/>
-            <w:r>
-              <w:rPr>
-                <w:sz w:val="18"/>
-              </w:rPr>
-              <w:t>DEF-07</w:t>
-            </w:r>
-          </w:p>
-        </w:tc>
-        <w:tc>
-          <w:tcPr>
-            <w:tcW w:type="dxa" w:w="1020"/>
-            <w:shd w:val="clear" w:color="auto" w:fill="FFC7CE"/>
-          </w:tcPr>
-          <w:p>
-            <w:r/>
-            <w:r>
-              <w:rPr>
-                <w:sz w:val="18"/>
-              </w:rPr>
-              <w:t>High</w:t>
-            </w:r>
-          </w:p>
-        </w:tc>
-        <w:tc>
-          <w:tcPr>
-            <w:tcW w:type="dxa" w:w="5102"/>
-          </w:tcPr>
-          <w:p>
-            <w:r/>
-            <w:r>
-              <w:rPr>
-                <w:sz w:val="18"/>
-              </w:rPr>
-              <w:t>Mandatory fields are not enforced by the back-end</w:t>
-            </w:r>
-          </w:p>
-        </w:tc>
-        <w:tc>
-          <w:tcPr>
-            <w:tcW w:type="dxa" w:w="2608"/>
-          </w:tcPr>
-          <w:p>
-            <w:r/>
-            <w:r>
-              <w:rPr>
-                <w:sz w:val="18"/>
-              </w:rPr>
-              <w:t>TL-VAL-01..14, TL-VAL-16</w:t>
-            </w:r>
-          </w:p>
-        </w:tc>
-      </w:tr>
-      <w:tr>
-        <w:tc>
-          <w:tcPr>
-            <w:tcW w:type="dxa" w:w="907"/>
-          </w:tcPr>
-          <w:p>
-            <w:r/>
-            <w:r>
-              <w:rPr>
-                <w:sz w:val="18"/>
-              </w:rPr>
-              <w:t>DEF-08</w:t>
+              <w:t>DEF-04</w:t>
             </w:r>
           </w:p>
         </w:tc>
@@ -2579,7 +2734,7 @@
               <w:rPr>
                 <w:sz w:val="18"/>
               </w:rPr>
-              <w:t>Monthly premium mode accepted for Term Life</w:t>
+              <w:t>Repeat cancel-check on a pending request returns stale refund data for the old date</w:t>
             </w:r>
           </w:p>
         </w:tc>
@@ -2593,7 +2748,7 @@
               <w:rPr>
                 <w:sz w:val="18"/>
               </w:rPr>
-              <w:t>TL-PREM-96</w:t>
+              <w:t>TL-CAN-21</w:t>
             </w:r>
           </w:p>
         </w:tc>
@@ -2609,184 +2764,7 @@
               <w:rPr>
                 <w:sz w:val="18"/>
               </w:rPr>
-              <w:t>DEF-09</w:t>
-            </w:r>
-          </w:p>
-        </w:tc>
-        <w:tc>
-          <w:tcPr>
-            <w:tcW w:type="dxa" w:w="1020"/>
-            <w:shd w:val="clear" w:color="auto" w:fill="FFEB9C"/>
-          </w:tcPr>
-          <w:p>
-            <w:r/>
-            <w:r>
-              <w:rPr>
-                <w:sz w:val="18"/>
-              </w:rPr>
-              <w:t>Medium</w:t>
-            </w:r>
-          </w:p>
-        </w:tc>
-        <w:tc>
-          <w:tcPr>
-            <w:tcW w:type="dxa" w:w="5102"/>
-          </w:tcPr>
-          <w:p>
-            <w:r/>
-            <w:r>
-              <w:rPr>
-                <w:sz w:val="18"/>
-              </w:rPr>
-              <w:t>Policy term / expiry not validated or derived</w:t>
-            </w:r>
-          </w:p>
-        </w:tc>
-        <w:tc>
-          <w:tcPr>
-            <w:tcW w:type="dxa" w:w="2608"/>
-          </w:tcPr>
-          <w:p>
-            <w:r/>
-            <w:r>
-              <w:rPr>
-                <w:sz w:val="18"/>
-              </w:rPr>
-              <w:t>TL-TERM-01..06</w:t>
-            </w:r>
-          </w:p>
-        </w:tc>
-      </w:tr>
-      <w:tr>
-        <w:tc>
-          <w:tcPr>
-            <w:tcW w:type="dxa" w:w="907"/>
-          </w:tcPr>
-          <w:p>
-            <w:r/>
-            <w:r>
-              <w:rPr>
-                <w:sz w:val="18"/>
-              </w:rPr>
-              <w:t>DEF-10</w:t>
-            </w:r>
-          </w:p>
-        </w:tc>
-        <w:tc>
-          <w:tcPr>
-            <w:tcW w:type="dxa" w:w="1020"/>
-            <w:shd w:val="clear" w:color="auto" w:fill="FFEB9C"/>
-          </w:tcPr>
-          <w:p>
-            <w:r/>
-            <w:r>
-              <w:rPr>
-                <w:sz w:val="18"/>
-              </w:rPr>
-              <w:t>Medium</w:t>
-            </w:r>
-          </w:p>
-        </w:tc>
-        <w:tc>
-          <w:tcPr>
-            <w:tcW w:type="dxa" w:w="5102"/>
-          </w:tcPr>
-          <w:p>
-            <w:r/>
-            <w:r>
-              <w:rPr>
-                <w:sz w:val="18"/>
-              </w:rPr>
-              <w:t>Data-quality validations missing</w:t>
-            </w:r>
-          </w:p>
-        </w:tc>
-        <w:tc>
-          <w:tcPr>
-            <w:tcW w:type="dxa" w:w="2608"/>
-          </w:tcPr>
-          <w:p>
-            <w:r/>
-            <w:r>
-              <w:rPr>
-                <w:sz w:val="18"/>
-              </w:rPr>
-              <w:t>TL-VAL-30,31,32,34, TL-LOV-24, TL-LOV-31, TL-DATE-01, TL-DATE-02</w:t>
-            </w:r>
-          </w:p>
-        </w:tc>
-      </w:tr>
-      <w:tr>
-        <w:tc>
-          <w:tcPr>
-            <w:tcW w:type="dxa" w:w="907"/>
-          </w:tcPr>
-          <w:p>
-            <w:r/>
-            <w:r>
-              <w:rPr>
-                <w:sz w:val="18"/>
-              </w:rPr>
-              <w:t>DEF-11</w:t>
-            </w:r>
-          </w:p>
-        </w:tc>
-        <w:tc>
-          <w:tcPr>
-            <w:tcW w:type="dxa" w:w="1020"/>
-            <w:shd w:val="clear" w:color="auto" w:fill="FFEB9C"/>
-          </w:tcPr>
-          <w:p>
-            <w:r/>
-            <w:r>
-              <w:rPr>
-                <w:sz w:val="18"/>
-              </w:rPr>
-              <w:t>Medium</w:t>
-            </w:r>
-          </w:p>
-        </w:tc>
-        <w:tc>
-          <w:tcPr>
-            <w:tcW w:type="dxa" w:w="5102"/>
-          </w:tcPr>
-          <w:p>
-            <w:r/>
-            <w:r>
-              <w:rPr>
-                <w:sz w:val="18"/>
-              </w:rPr>
-              <w:t>Repeat cancel-check on a pending request returns stale data and skips validation</w:t>
-            </w:r>
-          </w:p>
-        </w:tc>
-        <w:tc>
-          <w:tcPr>
-            <w:tcW w:type="dxa" w:w="2608"/>
-          </w:tcPr>
-          <w:p>
-            <w:r/>
-            <w:r>
-              <w:rPr>
-                <w:sz w:val="18"/>
-              </w:rPr>
-              <w:t>TL-CAN-21 (masked TL-CAN-05/06 in first run)</w:t>
-            </w:r>
-          </w:p>
-        </w:tc>
-      </w:tr>
-      <w:tr>
-        <w:tc>
-          <w:tcPr>
-            <w:tcW w:type="dxa" w:w="907"/>
-          </w:tcPr>
-          <w:p>
-            <w:r/>
-            <w:r>
-              <w:rPr>
-                <w:sz w:val="18"/>
-              </w:rPr>
-              <w:t>DEF-12</w:t>
+              <w:t>DEF-05</w:t>
             </w:r>
           </w:p>
         </w:tc>
@@ -2845,7 +2823,7 @@
               <w:rPr>
                 <w:sz w:val="18"/>
               </w:rPr>
-              <w:t>DEF-13</w:t>
+              <w:t>DEF-06</w:t>
             </w:r>
           </w:p>
         </w:tc>
@@ -2904,7 +2882,7 @@
               <w:rPr>
                 <w:sz w:val="18"/>
               </w:rPr>
-              <w:t>DEF-14</w:t>
+              <w:t>DEF-07</w:t>
             </w:r>
           </w:p>
         </w:tc>
@@ -2963,184 +2941,7 @@
               <w:rPr>
                 <w:sz w:val="18"/>
               </w:rPr>
-              <w:t>DEF-15</w:t>
-            </w:r>
-          </w:p>
-        </w:tc>
-        <w:tc>
-          <w:tcPr>
-            <w:tcW w:type="dxa" w:w="1020"/>
-            <w:shd w:val="clear" w:color="auto" w:fill="FFEB9C"/>
-          </w:tcPr>
-          <w:p>
-            <w:r/>
-            <w:r>
-              <w:rPr>
-                <w:sz w:val="18"/>
-              </w:rPr>
-              <w:t>Medium</w:t>
-            </w:r>
-          </w:p>
-        </w:tc>
-        <w:tc>
-          <w:tcPr>
-            <w:tcW w:type="dxa" w:w="5102"/>
-          </w:tcPr>
-          <w:p>
-            <w:r/>
-            <w:r>
-              <w:rPr>
-                <w:sz w:val="18"/>
-              </w:rPr>
-              <w:t>Blank certificate generated for non-existent policy and for un-issued proposal</w:t>
-            </w:r>
-          </w:p>
-        </w:tc>
-        <w:tc>
-          <w:tcPr>
-            <w:tcW w:type="dxa" w:w="2608"/>
-          </w:tcPr>
-          <w:p>
-            <w:r/>
-            <w:r>
-              <w:rPr>
-                <w:sz w:val="18"/>
-              </w:rPr>
-              <w:t>TL-DOC-09, TL-DOC-10</w:t>
-            </w:r>
-          </w:p>
-        </w:tc>
-      </w:tr>
-      <w:tr>
-        <w:tc>
-          <w:tcPr>
-            <w:tcW w:type="dxa" w:w="907"/>
-          </w:tcPr>
-          <w:p>
-            <w:r/>
-            <w:r>
-              <w:rPr>
-                <w:sz w:val="18"/>
-              </w:rPr>
-              <w:t>DEF-16</w:t>
-            </w:r>
-          </w:p>
-        </w:tc>
-        <w:tc>
-          <w:tcPr>
-            <w:tcW w:type="dxa" w:w="1020"/>
-            <w:shd w:val="clear" w:color="auto" w:fill="FFEB9C"/>
-          </w:tcPr>
-          <w:p>
-            <w:r/>
-            <w:r>
-              <w:rPr>
-                <w:sz w:val="18"/>
-              </w:rPr>
-              <w:t>Medium</w:t>
-            </w:r>
-          </w:p>
-        </w:tc>
-        <w:tc>
-          <w:tcPr>
-            <w:tcW w:type="dxa" w:w="5102"/>
-          </w:tcPr>
-          <w:p>
-            <w:r/>
-            <w:r>
-              <w:rPr>
-                <w:sz w:val="18"/>
-              </w:rPr>
-              <w:t>Business-validation errors return HTTP 500 INTERNAL_ERROR and leak internal details</w:t>
-            </w:r>
-          </w:p>
-        </w:tc>
-        <w:tc>
-          <w:tcPr>
-            <w:tcW w:type="dxa" w:w="2608"/>
-          </w:tcPr>
-          <w:p>
-            <w:r/>
-            <w:r>
-              <w:rPr>
-                <w:sz w:val="18"/>
-              </w:rPr>
-              <w:t>TL-NFR-06, TL-POL-02, TL-LOAD-02/03, TL-PLAN-12</w:t>
-            </w:r>
-          </w:p>
-        </w:tc>
-      </w:tr>
-      <w:tr>
-        <w:tc>
-          <w:tcPr>
-            <w:tcW w:type="dxa" w:w="907"/>
-          </w:tcPr>
-          <w:p>
-            <w:r/>
-            <w:r>
-              <w:rPr>
-                <w:sz w:val="18"/>
-              </w:rPr>
-              <w:t>DEF-17</w:t>
-            </w:r>
-          </w:p>
-        </w:tc>
-        <w:tc>
-          <w:tcPr>
-            <w:tcW w:type="dxa" w:w="1020"/>
-            <w:shd w:val="clear" w:color="auto" w:fill="FFEB9C"/>
-          </w:tcPr>
-          <w:p>
-            <w:r/>
-            <w:r>
-              <w:rPr>
-                <w:sz w:val="18"/>
-              </w:rPr>
-              <w:t>Medium</w:t>
-            </w:r>
-          </w:p>
-        </w:tc>
-        <w:tc>
-          <w:tcPr>
-            <w:tcW w:type="dxa" w:w="5102"/>
-          </w:tcPr>
-          <w:p>
-            <w:r/>
-            <w:r>
-              <w:rPr>
-                <w:sz w:val="18"/>
-              </w:rPr>
-              <w:t>ChannelCode not enforced as a data boundary</w:t>
-            </w:r>
-          </w:p>
-        </w:tc>
-        <w:tc>
-          <w:tcPr>
-            <w:tcW w:type="dxa" w:w="2608"/>
-          </w:tcPr>
-          <w:p>
-            <w:r/>
-            <w:r>
-              <w:rPr>
-                <w:sz w:val="18"/>
-              </w:rPr>
-              <w:t>TL-PLAN-14, TL-PLAN-15, TL-POL-03</w:t>
-            </w:r>
-          </w:p>
-        </w:tc>
-      </w:tr>
-      <w:tr>
-        <w:tc>
-          <w:tcPr>
-            <w:tcW w:type="dxa" w:w="907"/>
-          </w:tcPr>
-          <w:p>
-            <w:r/>
-            <w:r>
-              <w:rPr>
-                <w:sz w:val="18"/>
-              </w:rPr>
-              <w:t>DEF-18</w:t>
+              <w:t>DEF-08</w:t>
             </w:r>
           </w:p>
         </w:tc>
@@ -3169,7 +2970,7 @@
               <w:rPr>
                 <w:sz w:val="18"/>
               </w:rPr>
-              <w:t>Feed missing Branch Code, LCCode, LGCode columns; invalid Module accepted</w:t>
+              <w:t>Feed file is missing Branch Code, LCCode and LGCode columns</w:t>
             </w:r>
           </w:p>
         </w:tc>
@@ -3183,7 +2984,7 @@
               <w:rPr>
                 <w:sz w:val="18"/>
               </w:rPr>
-              <w:t>TL-FEED-02, TL-FEED-12</w:t>
+              <w:t>TL-FEED-02</w:t>
             </w:r>
           </w:p>
         </w:tc>
@@ -3195,95 +2996,7 @@
         <w:pStyle w:val="Heading3"/>
       </w:pPr>
       <w:r>
-        <w:t>DEF-01 – A rejected proposal can still be issued as an Effective policy</w:t>
-      </w:r>
-    </w:p>
-    <w:p>
-      <w:r>
-        <w:rPr>
-          <w:b/>
-        </w:rPr>
-        <w:t xml:space="preserve">Severity: </w:t>
-      </w:r>
-      <w:r>
-        <w:t xml:space="preserve">Critical   </w:t>
-      </w:r>
-      <w:r>
-        <w:rPr>
-          <w:b/>
-        </w:rPr>
-        <w:t xml:space="preserve">Spec: </w:t>
-      </w:r>
-      <w:r>
-        <w:t>Policy Lifecycle – Approval Process (approve or reject)</w:t>
-      </w:r>
-    </w:p>
-    <w:p>
-      <w:r>
-        <w:t>Create proposal → proposal-reject (SUCCESS, ProposalStatus=4) → issue returns HTTP 200 with a new PolicyNo (POTL00100000016, PolicyStatus=2). Checker rejection is bypassable; business control failure.</w:t>
-      </w:r>
-    </w:p>
-    <w:p>
-      <w:r>
-        <w:rPr>
-          <w:b/>
-        </w:rPr>
-        <w:t xml:space="preserve">Recommendation: </w:t>
-      </w:r>
-      <w:r>
-        <w:t>Block issue (and update) when ProposalStatus = Rejected; return a clear 4xx.</w:t>
-      </w:r>
-    </w:p>
-    <w:p>
-      <w:pPr>
-        <w:pStyle w:val="Heading3"/>
-      </w:pPr>
-      <w:r>
-        <w:t>DEF-02 – Policy can be issued without LC Code, LG Code or payment/debit details</w:t>
-      </w:r>
-    </w:p>
-    <w:p>
-      <w:r>
-        <w:rPr>
-          <w:b/>
-        </w:rPr>
-        <w:t xml:space="preserve">Severity: </w:t>
-      </w:r>
-      <w:r>
-        <w:t xml:space="preserve">Critical   </w:t>
-      </w:r>
-      <w:r>
-        <w:rPr>
-          <w:b/>
-        </w:rPr>
-        <w:t xml:space="preserve">Spec: </w:t>
-      </w:r>
-      <w:r>
-        <w:t>Fields sheet – LC Code / LG Code 'Mandatory (before policy conversion)'</w:t>
-      </w:r>
-    </w:p>
-    <w:p>
-      <w:r>
-        <w:t>Proposal saved without PolicyPaymentInfoList and then issued → POTL00100000003 Effective. Spec: LC Code, LG Code, Premium mandatory before policy conversion.</w:t>
-      </w:r>
-    </w:p>
-    <w:p>
-      <w:r>
-        <w:rPr>
-          <w:b/>
-        </w:rPr>
-        <w:t xml:space="preserve">Recommendation: </w:t>
-      </w:r>
-      <w:r>
-        <w:t>Enforce mandatory payment fields (and validate LG/LC against master) in the issue step.</w:t>
-      </w:r>
-    </w:p>
-    <w:p>
-      <w:pPr>
-        <w:pStyle w:val="Heading3"/>
-      </w:pPr>
-      <w:r>
-        <w:t>DEF-03 – Sum Insured is double-counted – PlanList contains a duplicate, empty plan entry</w:t>
+        <w:t>DEF-01 – Sum Insured is double-counted – PlanList contains a duplicate, empty plan entry</w:t>
       </w:r>
     </w:p>
     <w:p>
@@ -3327,7 +3040,7 @@
         <w:pStyle w:val="Heading3"/>
       </w:pPr>
       <w:r>
-        <w:t>DEF-04 – Product Name in feed is wrong for Term Life policies</w:t>
+        <w:t>DEF-02 – Product Name in feed is wrong for Term Life policies</w:t>
       </w:r>
     </w:p>
     <w:p>
@@ -3371,7 +3084,7 @@
         <w:pStyle w:val="Heading3"/>
       </w:pPr>
       <w:r>
-        <w:t>DEF-05 – Cancelled Date populated for non-cancelled (Effective) policies</w:t>
+        <w:t>DEF-03 – Cancelled Date populated for non-cancelled (Effective) policies</w:t>
       </w:r>
     </w:p>
     <w:p>
@@ -3408,94 +3121,6 @@
       </w:r>
       <w:r>
         <w:t>Populate only when policy status = Cancelled.</w:t>
-      </w:r>
-    </w:p>
-    <w:p>
-      <w:pPr>
-        <w:pStyle w:val="Heading3"/>
-      </w:pPr>
-      <w:r>
-        <w:t>DEF-06 – Beneficiary share total is not validated</w:t>
-      </w:r>
-    </w:p>
-    <w:p>
-      <w:r>
-        <w:rPr>
-          <w:b/>
-        </w:rPr>
-        <w:t xml:space="preserve">Severity: </w:t>
-      </w:r>
-      <w:r>
-        <w:t xml:space="preserve">High   </w:t>
-      </w:r>
-      <w:r>
-        <w:rPr>
-          <w:b/>
-        </w:rPr>
-        <w:t xml:space="preserve">Spec: </w:t>
-      </w:r>
-      <w:r>
-        <w:t>Application form / Fields – Beneficiary</w:t>
-      </w:r>
-    </w:p>
-    <w:p>
-      <w:r>
-        <w:t>Shares 50 (single), 60+60, 150, -100 and a blank beneficiary name were all accepted. Forms state 'Share % (total to equal 100%)'.</w:t>
-      </w:r>
-    </w:p>
-    <w:p>
-      <w:r>
-        <w:rPr>
-          <w:b/>
-        </w:rPr>
-        <w:t xml:space="preserve">Recommendation: </w:t>
-      </w:r>
-      <w:r>
-        <w:t>Validate Σshare = 100, each 0&lt;share≤100, name mandatory, at least one beneficiary.</w:t>
-      </w:r>
-    </w:p>
-    <w:p>
-      <w:pPr>
-        <w:pStyle w:val="Heading3"/>
-      </w:pPr>
-      <w:r>
-        <w:t>DEF-07 – Mandatory fields are not enforced by the back-end</w:t>
-      </w:r>
-    </w:p>
-    <w:p>
-      <w:r>
-        <w:rPr>
-          <w:b/>
-        </w:rPr>
-        <w:t xml:space="preserve">Severity: </w:t>
-      </w:r>
-      <w:r>
-        <w:t xml:space="preserve">High   </w:t>
-      </w:r>
-      <w:r>
-        <w:rPr>
-          <w:b/>
-        </w:rPr>
-        <w:t xml:space="preserve">Spec: </w:t>
-      </w:r>
-      <w:r>
-        <w:t>Fields sheet – 'Mandatory' flags</w:t>
-      </w:r>
-    </w:p>
-    <w:p>
-      <w:r>
-        <w:t>Proposal created successfully with InsuredName, DateOfBirth, Gender, IdNo, IdType, Salutation, ResidentStatus, Email, Mobile, MaritalStatus, Address, CIFNumber, CustomerType, BranchCode or PremiumModeCode omitted (14 of 16 tested). Only PlanId is enforced (via an iHub exception).</w:t>
-      </w:r>
-    </w:p>
-    <w:p>
-      <w:r>
-        <w:rPr>
-          <w:b/>
-        </w:rPr>
-        <w:t xml:space="preserve">Recommendation: </w:t>
-      </w:r>
-      <w:r>
-        <w:t>Add mandatory-field validation in the Create/Update Proposal API (UI-only validation is bypassable).</w:t>
       </w:r>
     </w:p>
     <w:p>
@@ -3713,50 +3338,6 @@
               <w:rPr>
                 <w:sz w:val="18"/>
               </w:rPr>
-              <w:t>TL-PLAN-13</w:t>
-            </w:r>
-          </w:p>
-        </w:tc>
-        <w:tc>
-          <w:tcPr>
-            <w:tcW w:type="dxa" w:w="3118"/>
-          </w:tcPr>
-          <w:p>
-            <w:r/>
-            <w:r>
-              <w:rPr>
-                <w:sz w:val="18"/>
-              </w:rPr>
-              <w:t>Invalid ProductSubcode (3) rejected</w:t>
-            </w:r>
-          </w:p>
-        </w:tc>
-        <w:tc>
-          <w:tcPr>
-            <w:tcW w:type="dxa" w:w="5386"/>
-          </w:tcPr>
-          <w:p>
-            <w:r/>
-            <w:r>
-              <w:rPr>
-                <w:sz w:val="18"/>
-              </w:rPr>
-              <w:t>Invalid ProductSubcode 3 → HTTP 200 with empty PlanList (no error returned). UI must handle empty plan list.</w:t>
-            </w:r>
-          </w:p>
-        </w:tc>
-      </w:tr>
-      <w:tr>
-        <w:tc>
-          <w:tcPr>
-            <w:tcW w:type="dxa" w:w="1134"/>
-          </w:tcPr>
-          <w:p>
-            <w:r/>
-            <w:r>
-              <w:rPr>
-                <w:sz w:val="18"/>
-              </w:rPr>
               <w:t>TL-PREM-93</w:t>
             </w:r>
           </w:p>
@@ -3845,226 +3426,6 @@
               <w:rPr>
                 <w:sz w:val="18"/>
               </w:rPr>
-              <w:t>TL-UW-01</w:t>
-            </w:r>
-          </w:p>
-        </w:tc>
-        <w:tc>
-          <w:tcPr>
-            <w:tcW w:type="dxa" w:w="3118"/>
-          </w:tcPr>
-          <w:p>
-            <w:r/>
-            <w:r>
-              <w:rPr>
-                <w:sz w:val="18"/>
-              </w:rPr>
-              <w:t>Age 17y 364d – below min age 18 (DOB 2008-10-14) at 2026-10-13</w:t>
-            </w:r>
-          </w:p>
-        </w:tc>
-        <w:tc>
-          <w:tcPr>
-            <w:tcW w:type="dxa" w:w="5386"/>
-          </w:tcPr>
-          <w:p>
-            <w:r/>
-            <w:r>
-              <w:rPr>
-                <w:sz w:val="18"/>
-              </w:rPr>
-              <w:t>Backend accepted DOB 2008-10-14 (17y 364d – below min age 18). Spec: age rules (min 18, max entry 64, max age 69, exit 70) are enforced by Uponly UI; backend enforcement absent – recommend defence-in-depth.</w:t>
-            </w:r>
-          </w:p>
-        </w:tc>
-      </w:tr>
-      <w:tr>
-        <w:tc>
-          <w:tcPr>
-            <w:tcW w:type="dxa" w:w="1134"/>
-          </w:tcPr>
-          <w:p>
-            <w:r/>
-            <w:r>
-              <w:rPr>
-                <w:sz w:val="18"/>
-              </w:rPr>
-              <w:t>TL-UW-04</w:t>
-            </w:r>
-          </w:p>
-        </w:tc>
-        <w:tc>
-          <w:tcPr>
-            <w:tcW w:type="dxa" w:w="3118"/>
-          </w:tcPr>
-          <w:p>
-            <w:r/>
-            <w:r>
-              <w:rPr>
-                <w:sz w:val="18"/>
-              </w:rPr>
-              <w:t>Age exactly 65 – above max entry age 64 (DOB 1961-10-13) at 2026-10-13</w:t>
-            </w:r>
-          </w:p>
-        </w:tc>
-        <w:tc>
-          <w:tcPr>
-            <w:tcW w:type="dxa" w:w="5386"/>
-          </w:tcPr>
-          <w:p>
-            <w:r/>
-            <w:r>
-              <w:rPr>
-                <w:sz w:val="18"/>
-              </w:rPr>
-              <w:t>Backend accepted DOB 1961-10-13 (exactly 65 – above max entry age 64). Spec: age rules (min 18, max entry 64, max age 69, exit 70) are enforced by Uponly UI; backend enforcement absent – recommend defence-in-depth.</w:t>
-            </w:r>
-          </w:p>
-        </w:tc>
-      </w:tr>
-      <w:tr>
-        <w:tc>
-          <w:tcPr>
-            <w:tcW w:type="dxa" w:w="1134"/>
-          </w:tcPr>
-          <w:p>
-            <w:r/>
-            <w:r>
-              <w:rPr>
-                <w:sz w:val="18"/>
-              </w:rPr>
-              <w:t>TL-UW-05</w:t>
-            </w:r>
-          </w:p>
-        </w:tc>
-        <w:tc>
-          <w:tcPr>
-            <w:tcW w:type="dxa" w:w="3118"/>
-          </w:tcPr>
-          <w:p>
-            <w:r/>
-            <w:r>
-              <w:rPr>
-                <w:sz w:val="18"/>
-              </w:rPr>
-              <w:t>Age 68y – above max entry 64 (DOB 1957-10-14) at 2026-10-13</w:t>
-            </w:r>
-          </w:p>
-        </w:tc>
-        <w:tc>
-          <w:tcPr>
-            <w:tcW w:type="dxa" w:w="5386"/>
-          </w:tcPr>
-          <w:p>
-            <w:r/>
-            <w:r>
-              <w:rPr>
-                <w:sz w:val="18"/>
-              </w:rPr>
-              <w:t>Backend accepted DOB 1957-10-14 (68y – above max entry 64). Spec: age rules (min 18, max entry 64, max age 69, exit 70) are enforced by Uponly UI; backend enforcement absent – recommend defence-in-depth.</w:t>
-            </w:r>
-          </w:p>
-        </w:tc>
-      </w:tr>
-      <w:tr>
-        <w:tc>
-          <w:tcPr>
-            <w:tcW w:type="dxa" w:w="1134"/>
-          </w:tcPr>
-          <w:p>
-            <w:r/>
-            <w:r>
-              <w:rPr>
-                <w:sz w:val="18"/>
-              </w:rPr>
-              <w:t>TL-UW-06</w:t>
-            </w:r>
-          </w:p>
-        </w:tc>
-        <w:tc>
-          <w:tcPr>
-            <w:tcW w:type="dxa" w:w="3118"/>
-          </w:tcPr>
-          <w:p>
-            <w:r/>
-            <w:r>
-              <w:rPr>
-                <w:sz w:val="18"/>
-              </w:rPr>
-              <w:t>Age 70y – above max age 69 / exit 70 (DOB 1956-10-12) at 2026-10-13</w:t>
-            </w:r>
-          </w:p>
-        </w:tc>
-        <w:tc>
-          <w:tcPr>
-            <w:tcW w:type="dxa" w:w="5386"/>
-          </w:tcPr>
-          <w:p>
-            <w:r/>
-            <w:r>
-              <w:rPr>
-                <w:sz w:val="18"/>
-              </w:rPr>
-              <w:t>Backend accepted DOB 1956-10-12 (70y – above max age 69 / exit 70). Spec: age rules (min 18, max entry 64, max age 69, exit 70) are enforced by Uponly UI; backend enforcement absent – recommend defence-in-depth.</w:t>
-            </w:r>
-          </w:p>
-        </w:tc>
-      </w:tr>
-      <w:tr>
-        <w:tc>
-          <w:tcPr>
-            <w:tcW w:type="dxa" w:w="1134"/>
-          </w:tcPr>
-          <w:p>
-            <w:r/>
-            <w:r>
-              <w:rPr>
-                <w:sz w:val="18"/>
-              </w:rPr>
-              <w:t>TL-UW-07</w:t>
-            </w:r>
-          </w:p>
-        </w:tc>
-        <w:tc>
-          <w:tcPr>
-            <w:tcW w:type="dxa" w:w="3118"/>
-          </w:tcPr>
-          <w:p>
-            <w:r/>
-            <w:r>
-              <w:rPr>
-                <w:sz w:val="18"/>
-              </w:rPr>
-              <w:t>Age future date of birth (DOB 2030-01-01) at 2026-10-13</w:t>
-            </w:r>
-          </w:p>
-        </w:tc>
-        <w:tc>
-          <w:tcPr>
-            <w:tcW w:type="dxa" w:w="5386"/>
-          </w:tcPr>
-          <w:p>
-            <w:r/>
-            <w:r>
-              <w:rPr>
-                <w:sz w:val="18"/>
-              </w:rPr>
-              <w:t>Backend accepted DOB 2030-01-01 (future date of birth). Spec: age rules (min 18, max entry 64, max age 69, exit 70) are enforced by Uponly UI; backend enforcement absent – recommend defence-in-depth.</w:t>
-            </w:r>
-          </w:p>
-        </w:tc>
-      </w:tr>
-      <w:tr>
-        <w:tc>
-          <w:tcPr>
-            <w:tcW w:type="dxa" w:w="1134"/>
-          </w:tcPr>
-          <w:p>
-            <w:r/>
-            <w:r>
-              <w:rPr>
-                <w:sz w:val="18"/>
-              </w:rPr>
               <w:t>TL-UW-08</w:t>
             </w:r>
           </w:p>
@@ -4094,50 +3455,6 @@
                 <w:sz w:val="18"/>
               </w:rPr>
               <w:t>Entry at 64y 364d with 1-year term → age at expiry 65, within exit age 70: OK. Multi-year single-premium exit-age (70) check can't be validated – term/expiry not enforced (see TL-TERM).</w:t>
-            </w:r>
-          </w:p>
-        </w:tc>
-      </w:tr>
-      <w:tr>
-        <w:tc>
-          <w:tcPr>
-            <w:tcW w:type="dxa" w:w="1134"/>
-          </w:tcPr>
-          <w:p>
-            <w:r/>
-            <w:r>
-              <w:rPr>
-                <w:sz w:val="18"/>
-              </w:rPr>
-              <w:t>TL-PAY-04</w:t>
-            </w:r>
-          </w:p>
-        </w:tc>
-        <w:tc>
-          <w:tcPr>
-            <w:tcW w:type="dxa" w:w="3118"/>
-          </w:tcPr>
-          <w:p>
-            <w:r/>
-            <w:r>
-              <w:rPr>
-                <w:sz w:val="18"/>
-              </w:rPr>
-              <w:t>Invalid LG Code handling</w:t>
-            </w:r>
-          </w:p>
-        </w:tc>
-        <w:tc>
-          <w:tcPr>
-            <w:tcW w:type="dxa" w:w="5386"/>
-          </w:tcPr>
-          <w:p>
-            <w:r/>
-            <w:r>
-              <w:rPr>
-                <w:sz w:val="18"/>
-              </w:rPr>
-              <w:t>LGCode 'ZZ' (arbitrary) accepted – LG/LC codes are not validated against a master list.</w:t>
             </w:r>
           </w:p>
         </w:tc>
@@ -4197,138 +3514,6 @@
               <w:rPr>
                 <w:sz w:val="18"/>
               </w:rPr>
-              <w:t>TL-LOAD-02</w:t>
-            </w:r>
-          </w:p>
-        </w:tc>
-        <w:tc>
-          <w:tcPr>
-            <w:tcW w:type="dxa" w:w="3118"/>
-          </w:tcPr>
-          <w:p>
-            <w:r/>
-            <w:r>
-              <w:rPr>
-                <w:sz w:val="18"/>
-              </w:rPr>
-              <w:t>Load of non-existent ProposalNo returns error</w:t>
-            </w:r>
-          </w:p>
-        </w:tc>
-        <w:tc>
-          <w:tcPr>
-            <w:tcW w:type="dxa" w:w="5386"/>
-          </w:tcPr>
-          <w:p>
-            <w:r/>
-            <w:r>
-              <w:rPr>
-                <w:sz w:val="18"/>
-              </w:rPr>
-              <w:t>Non-existent ProposalNo → HTTP 200 with body validateResult.errors[]: 'Proposal not found for proposal no: …'. Error is carried in a 200 body (other APIs use 400/404) – consumers must inspect body.</w:t>
-            </w:r>
-          </w:p>
-        </w:tc>
-      </w:tr>
-      <w:tr>
-        <w:tc>
-          <w:tcPr>
-            <w:tcW w:type="dxa" w:w="1134"/>
-          </w:tcPr>
-          <w:p>
-            <w:r/>
-            <w:r>
-              <w:rPr>
-                <w:sz w:val="18"/>
-              </w:rPr>
-              <w:t>TL-LOAD-03</w:t>
-            </w:r>
-          </w:p>
-        </w:tc>
-        <w:tc>
-          <w:tcPr>
-            <w:tcW w:type="dxa" w:w="3118"/>
-          </w:tcPr>
-          <w:p>
-            <w:r/>
-            <w:r>
-              <w:rPr>
-                <w:sz w:val="18"/>
-              </w:rPr>
-              <w:t>Load with neither proposalNo nor policyNo rejected</w:t>
-            </w:r>
-          </w:p>
-        </w:tc>
-        <w:tc>
-          <w:tcPr>
-            <w:tcW w:type="dxa" w:w="5386"/>
-          </w:tcPr>
-          <w:p>
-            <w:r/>
-            <w:r>
-              <w:rPr>
-                <w:sz w:val="18"/>
-              </w:rPr>
-              <w:t>Missing identifiers → HTTP 200 with body validateResult.errors[]: 'quotationNo, proposalNo, or policyNo parameter is missing.' (HTTP 200 for an error).</w:t>
-            </w:r>
-          </w:p>
-        </w:tc>
-      </w:tr>
-      <w:tr>
-        <w:tc>
-          <w:tcPr>
-            <w:tcW w:type="dxa" w:w="1134"/>
-          </w:tcPr>
-          <w:p>
-            <w:r/>
-            <w:r>
-              <w:rPr>
-                <w:sz w:val="18"/>
-              </w:rPr>
-              <w:t>TL-POL-02</w:t>
-            </w:r>
-          </w:p>
-        </w:tc>
-        <w:tc>
-          <w:tcPr>
-            <w:tcW w:type="dxa" w:w="3118"/>
-          </w:tcPr>
-          <w:p>
-            <w:r/>
-            <w:r>
-              <w:rPr>
-                <w:sz w:val="18"/>
-              </w:rPr>
-              <w:t>Load of non-existent PolicyNo returns error</w:t>
-            </w:r>
-          </w:p>
-        </w:tc>
-        <w:tc>
-          <w:tcPr>
-            <w:tcW w:type="dxa" w:w="5386"/>
-          </w:tcPr>
-          <w:p>
-            <w:r/>
-            <w:r>
-              <w:rPr>
-                <w:sz w:val="18"/>
-              </w:rPr>
-              <w:t>Non-existent PolicyNo → HTTP 500 and raw Java NPE text leaked: 'Cannot invoke "java.util.Map.get(Object)" because "policyResponse" is null'. Should be a clean 404.</w:t>
-            </w:r>
-          </w:p>
-        </w:tc>
-      </w:tr>
-      <w:tr>
-        <w:tc>
-          <w:tcPr>
-            <w:tcW w:type="dxa" w:w="1134"/>
-          </w:tcPr>
-          <w:p>
-            <w:r/>
-            <w:r>
-              <w:rPr>
-                <w:sz w:val="18"/>
-              </w:rPr>
               <w:t>TL-REJ-03</w:t>
             </w:r>
           </w:p>
@@ -4358,50 +3543,6 @@
                 <w:sz w:val="18"/>
               </w:rPr>
               <w:t>Second reject → HTTP 500 : java.lang.RuntimeException: Error occured while calling iHub integration service at url https://uponlyuat-sandbox-in.insuremo.com/api/uponlyuat/api-orchestration/v1/flow/create-proposal-reject, StatusError : ,call [htt</w:t>
-            </w:r>
-          </w:p>
-        </w:tc>
-      </w:tr>
-      <w:tr>
-        <w:tc>
-          <w:tcPr>
-            <w:tcW w:type="dxa" w:w="1134"/>
-          </w:tcPr>
-          <w:p>
-            <w:r/>
-            <w:r>
-              <w:rPr>
-                <w:sz w:val="18"/>
-              </w:rPr>
-              <w:t>TL-REJ-05</w:t>
-            </w:r>
-          </w:p>
-        </w:tc>
-        <w:tc>
-          <w:tcPr>
-            <w:tcW w:type="dxa" w:w="3118"/>
-          </w:tcPr>
-          <w:p>
-            <w:r/>
-            <w:r>
-              <w:rPr>
-                <w:sz w:val="18"/>
-              </w:rPr>
-              <w:t>Reject without reason/comment rejected (checker must give comment)</w:t>
-            </w:r>
-          </w:p>
-        </w:tc>
-        <w:tc>
-          <w:tcPr>
-            <w:tcW w:type="dxa" w:w="5386"/>
-          </w:tcPr>
-          <w:p>
-            <w:r/>
-            <w:r>
-              <w:rPr>
-                <w:sz w:val="18"/>
-              </w:rPr>
-              <w:t>Reject without ProposalRejectDesc → HTTP 200 'Proposal rejected' (status 4). Spec: 'Enter comments if any' (optional) – accepted as designed; recommend mandatory reason for audit.</w:t>
             </w:r>
           </w:p>
         </w:tc>
@@ -4897,7 +4038,7 @@
         <w:rPr>
           <w:b/>
         </w:rPr>
-        <w:t xml:space="preserve">Age rules (TL-UW-01…07): </w:t>
+        <w:t xml:space="preserve">Age rules (TL-UW-01…07, by design): </w:t>
       </w:r>
       <w:r>
         <w:t>the back-end accepts ages 17, 65, 68, 70 and a future date of birth. The spec assigns age validation to the Uponly UI, so these are recorded as observations, but we recommend a back-end guard as well.</w:t>
@@ -5180,7 +4321,7 @@
         <w:pStyle w:val="ListBullet"/>
       </w:pPr>
       <w:r>
-        <w:t>Test oracles were reviewed after the run: about 20 results were re-tested against fresh data and corrected (for example cancellation-date checks that were masked by a pending request, and a certificate-field comparison that was a data-type mismatch). Remaining PASS results that rely on an HTTP 500 error are counted as 'rejected' – the 500 itself is logged as DEF-16.</w:t>
+        <w:t>Test oracles were reviewed after the run: about 20 results were re-tested against fresh data and corrected (for example cancellation-date checks that were masked by a pending request, and a certificate-field comparison that was a data-type mismatch). Remaining PASS results that rely on an HTTP 500 error are counted as 'rejected' – the 500 itself is noted as a by-design risk.</w:t>
       </w:r>
     </w:p>
     <w:p>
@@ -5201,7 +4342,7 @@
     </w:p>
     <w:p>
       <w:r>
-        <w:t>Fix DEF-01 to DEF-07 and re-run the failed cases (the runner re-executes the full suite in ~5 minutes) before UAT sign-off. DEF-08 to DEF-18 can be scheduled with business agreement; clarifications in section 5 should be answered first because DEF-09 and DEF-12 depend on them. UI test cases (TL-UI-01…24) must be executed on the Uponly front-end before final sign-off.</w:t>
+        <w:t>Fix the defects above and re-run the failed cases (the runner re-executes the full suite in ~5 minutes) before UAT sign-off. Clarifications in section 5 should be answered first because the free-look defect (DEF-05) depends on them. UI test cases (TL-UI-01…24) must be executed on the Uponly front-end before final sign-off.</w:t>
       </w:r>
     </w:p>
     <w:sectPr>

</xml_diff>